<commit_message>
feat: build tier-1 ats optimized master resume
Rebuild the master resume on the user's proven template (centered navy header,
ruled sections, right-aligned dates) with current verified facts. Header shows
clickable LinkedIn/GitHub labels with icons (no raw URLs) plus clickable email.
Nokia stated plainly (no confidentiality wording); every bullet leads with a
distinct verb and surfaces only real quantifiers (no fabricated metrics).

Add research/TIER1_RESUME_RESEARCH.md, per-role JD keyword analysis in
resume/ats-analysis.md, scripts/make_icons.py, and scripts/validate_resume.py
(parse/format/leakage checks + readiness score + plain-text export) replacing
scripts/ats_check.py. Generated PDF/DOCX/TXT; readiness ~96/100; validators pass.

Co-Authored-By: Claude Opus 4.8 <noreply@anthropic.com>
</commit_message>
<xml_diff>
--- a/resume/Mohammed_Shabaz_S_Master_Resume.docx
+++ b/resume/Mohammed_Shabaz_S_Master_Resume.docx
@@ -5,11 +5,13 @@
     <w:p>
       <w:pPr>
         <w:spacing w:before="0" w:after="0" w:line="240" w:lineRule="auto"/>
+        <w:jc w:val="center"/>
       </w:pPr>
       <w:r>
         <w:rPr>
           <w:b/>
-          <w:sz w:val="32"/>
+          <w:color w:val="1F3A5F"/>
+          <w:sz w:val="34"/>
         </w:rPr>
         <w:t>MOHAMMED SHABAZ S</w:t>
       </w:r>
@@ -17,29 +19,33 @@
     <w:p>
       <w:pPr>
         <w:spacing w:before="0" w:after="20" w:line="240" w:lineRule="auto"/>
+        <w:jc w:val="center"/>
       </w:pPr>
       <w:r>
         <w:rPr>
+          <w:color w:val="1F3A5F"/>
           <w:sz w:val="21"/>
         </w:rPr>
-        <w:t>Software Developer | Embedded Engineer</w:t>
+        <w:t>Software Developer  |  Embedded Engineer</w:t>
       </w:r>
     </w:p>
     <w:p>
       <w:pPr>
         <w:spacing w:before="0" w:after="40" w:line="240" w:lineRule="auto"/>
+        <w:jc w:val="center"/>
       </w:pPr>
       <w:r>
         <w:rPr>
           <w:sz w:val="18"/>
         </w:rPr>
-        <w:t xml:space="preserve">Ballari, Karnataka, India | 7975512403 | </w:t>
+        <w:t xml:space="preserve">Ballari, Karnataka  |  +91 79755 12403  |  </w:t>
       </w:r>
       <w:hyperlink r:id="rId9">
         <w:r>
           <w:rPr>
-            <w:color w:val="1155CC"/>
+            <w:color w:val="1F5FA8"/>
             <w:u w:val="single"/>
+            <w:sz w:val="18"/>
           </w:rPr>
           <w:t>md.shabaz.2005@gmail.com</w:t>
         </w:r>
@@ -48,49 +54,126 @@
         <w:rPr>
           <w:sz w:val="18"/>
         </w:rPr>
-        <w:t xml:space="preserve"> | </w:t>
+        <w:t xml:space="preserve">  |  </w:t>
       </w:r>
-      <w:hyperlink r:id="rId10">
+      <w:r>
+        <w:drawing>
+          <wp:inline xmlns:a="http://schemas.openxmlformats.org/drawingml/2006/main" xmlns:pic="http://schemas.openxmlformats.org/drawingml/2006/picture">
+            <wp:extent cx="114300" cy="114300"/>
+            <wp:docPr id="1" name="Picture 1"/>
+            <wp:cNvGraphicFramePr>
+              <a:graphicFrameLocks noChangeAspect="1"/>
+            </wp:cNvGraphicFramePr>
+            <a:graphic>
+              <a:graphicData uri="http://schemas.openxmlformats.org/drawingml/2006/picture">
+                <pic:pic>
+                  <pic:nvPicPr>
+                    <pic:cNvPr id="0" name="linkedin.png"/>
+                    <pic:cNvPicPr/>
+                  </pic:nvPicPr>
+                  <pic:blipFill>
+                    <a:blip r:embed="rId10"/>
+                    <a:stretch>
+                      <a:fillRect/>
+                    </a:stretch>
+                  </pic:blipFill>
+                  <pic:spPr>
+                    <a:xfrm>
+                      <a:off x="0" y="0"/>
+                      <a:ext cx="114300" cy="114300"/>
+                    </a:xfrm>
+                    <a:prstGeom prst="rect"/>
+                  </pic:spPr>
+                </pic:pic>
+              </a:graphicData>
+            </a:graphic>
+          </wp:inline>
+        </w:drawing>
+      </w:r>
+      <w:r>
+        <w:rPr>
+          <w:sz w:val="18"/>
+        </w:rPr>
+        <w:t xml:space="preserve"> </w:t>
+      </w:r>
+      <w:hyperlink r:id="rId11">
         <w:r>
           <w:rPr>
-            <w:color w:val="1155CC"/>
+            <w:color w:val="1F5FA8"/>
             <w:u w:val="single"/>
+            <w:sz w:val="18"/>
           </w:rPr>
-          <w:t>linkedin.com/in/shabaz17</w:t>
+          <w:t>LinkedIn</w:t>
         </w:r>
       </w:hyperlink>
       <w:r>
         <w:rPr>
           <w:sz w:val="18"/>
         </w:rPr>
-        <w:t xml:space="preserve"> | </w:t>
+        <w:t xml:space="preserve">  |  </w:t>
       </w:r>
-      <w:hyperlink r:id="rId11">
-        <w:r>
-          <w:rPr>
-            <w:color w:val="1155CC"/>
-            <w:u w:val="single"/>
-          </w:rPr>
-          <w:t>github.com/MdShabazS</w:t>
-        </w:r>
-      </w:hyperlink>
+      <w:r>
+        <w:drawing>
+          <wp:inline xmlns:a="http://schemas.openxmlformats.org/drawingml/2006/main" xmlns:pic="http://schemas.openxmlformats.org/drawingml/2006/picture">
+            <wp:extent cx="114300" cy="114300"/>
+            <wp:docPr id="2" name="Picture 2"/>
+            <wp:cNvGraphicFramePr>
+              <a:graphicFrameLocks noChangeAspect="1"/>
+            </wp:cNvGraphicFramePr>
+            <a:graphic>
+              <a:graphicData uri="http://schemas.openxmlformats.org/drawingml/2006/picture">
+                <pic:pic>
+                  <pic:nvPicPr>
+                    <pic:cNvPr id="0" name="github.png"/>
+                    <pic:cNvPicPr/>
+                  </pic:nvPicPr>
+                  <pic:blipFill>
+                    <a:blip r:embed="rId12"/>
+                    <a:stretch>
+                      <a:fillRect/>
+                    </a:stretch>
+                  </pic:blipFill>
+                  <pic:spPr>
+                    <a:xfrm>
+                      <a:off x="0" y="0"/>
+                      <a:ext cx="114300" cy="114300"/>
+                    </a:xfrm>
+                    <a:prstGeom prst="rect"/>
+                  </pic:spPr>
+                </pic:pic>
+              </a:graphicData>
+            </a:graphic>
+          </wp:inline>
+        </w:drawing>
+      </w:r>
       <w:r>
         <w:rPr>
           <w:sz w:val="18"/>
         </w:rPr>
-        <w:t xml:space="preserve"> | Portfolio: available on request</w:t>
+        <w:t xml:space="preserve"> </w:t>
       </w:r>
+      <w:hyperlink r:id="rId13">
+        <w:r>
+          <w:rPr>
+            <w:color w:val="1F5FA8"/>
+            <w:u w:val="single"/>
+            <w:sz w:val="18"/>
+          </w:rPr>
+          <w:t>GitHub</w:t>
+        </w:r>
+      </w:hyperlink>
     </w:p>
     <w:p>
       <w:pPr>
         <w:spacing w:before="120" w:after="20" w:line="240" w:lineRule="auto"/>
         <w:pBdr>
-          <w:bottom w:val="single" w:sz="6" w:space="1" w:color="9CA3AF"/>
+          <w:bottom w:val="single" w:sz="6" w:space="1" w:color="1F3A5F"/>
         </w:pBdr>
       </w:pPr>
       <w:r>
         <w:rPr>
           <w:b/>
+          <w:color w:val="1F3A5F"/>
           <w:sz w:val="21"/>
         </w:rPr>
         <w:t>SUMMARY</w:t>
@@ -101,70 +184,23 @@
         <w:spacing w:before="0" w:after="40" w:line="240" w:lineRule="auto"/>
       </w:pPr>
       <w:r>
-        <w:t>Final-year Electronics &amp; Communication Engineering student (CGPA 8.38) working across application software and embedded firmware. Internship experience at Nokia and iHelp Robotics, with projects in Android, computer vision, and microcontrollers using C/C++, Python, and Embedded C.</w:t>
+        <w:t>Final-year Electronics &amp; Communication Engineering student (CGPA 8.38) building across software and embedded systems. Internships at Nokia and iHelp Robotics, with projects in Android, computer vision, and microcontroller firmware using C, C++, Python and Embedded C. Currently deepening data structures, algorithms and SQL for software and embedded roles.</w:t>
       </w:r>
     </w:p>
     <w:p>
       <w:pPr>
         <w:spacing w:before="120" w:after="20" w:line="240" w:lineRule="auto"/>
         <w:pBdr>
-          <w:bottom w:val="single" w:sz="6" w:space="1" w:color="9CA3AF"/>
+          <w:bottom w:val="single" w:sz="6" w:space="1" w:color="1F3A5F"/>
         </w:pBdr>
       </w:pPr>
       <w:r>
         <w:rPr>
           <w:b/>
+          <w:color w:val="1F3A5F"/>
           <w:sz w:val="21"/>
         </w:rPr>
-        <w:t>EDUCATION</w:t>
-      </w:r>
-    </w:p>
-    <w:p>
-      <w:pPr>
-        <w:spacing w:before="0" w:after="20" w:line="240" w:lineRule="auto"/>
-      </w:pPr>
-      <w:r>
-        <w:rPr>
-          <w:b/>
-        </w:rPr>
-        <w:t>Ballari Institute of Technology and Management (BITM) — Ballari, Karnataka</w:t>
-      </w:r>
-    </w:p>
-    <w:p>
-      <w:pPr>
-        <w:spacing w:before="0" w:after="20" w:line="240" w:lineRule="auto"/>
-      </w:pPr>
-      <w:r>
-        <w:rPr>
-          <w:b w:val="0"/>
-        </w:rPr>
-        <w:t>B.E. Electronics &amp; Communication Engineering | Final Year | Expected 2027 | CGPA 8.38</w:t>
-      </w:r>
-    </w:p>
-    <w:p>
-      <w:pPr>
-        <w:spacing w:before="0" w:after="20" w:line="240" w:lineRule="auto"/>
-      </w:pPr>
-      <w:r>
-        <w:rPr>
-          <w:b w:val="0"/>
-        </w:rPr>
-        <w:t>Class 12: 80% | Class 10: 86.88%</w:t>
-      </w:r>
-    </w:p>
-    <w:p>
-      <w:pPr>
-        <w:spacing w:before="120" w:after="20" w:line="240" w:lineRule="auto"/>
-        <w:pBdr>
-          <w:bottom w:val="single" w:sz="6" w:space="1" w:color="9CA3AF"/>
-        </w:pBdr>
-      </w:pPr>
-      <w:r>
-        <w:rPr>
-          <w:b/>
-          <w:sz w:val="21"/>
-        </w:rPr>
-        <w:t>SKILLS</w:t>
+        <w:t>TECHNICAL SKILLS</w:t>
       </w:r>
     </w:p>
     <w:p>
@@ -227,12 +263,13 @@
       <w:pPr>
         <w:spacing w:before="120" w:after="20" w:line="240" w:lineRule="auto"/>
         <w:pBdr>
-          <w:bottom w:val="single" w:sz="6" w:space="1" w:color="9CA3AF"/>
+          <w:bottom w:val="single" w:sz="6" w:space="1" w:color="1F3A5F"/>
         </w:pBdr>
       </w:pPr>
       <w:r>
         <w:rPr>
           <w:b/>
+          <w:color w:val="1F3A5F"/>
           <w:sz w:val="21"/>
         </w:rPr>
         <w:t>EXPERIENCE</w:t>
@@ -240,13 +277,365 @@
     </w:p>
     <w:p>
       <w:pPr>
+        <w:tabs>
+          <w:tab w:pos="10469" w:val="right"/>
+        </w:tabs>
         <w:spacing w:before="60" w:after="0" w:line="240" w:lineRule="auto"/>
       </w:pPr>
       <w:r>
         <w:rPr>
           <w:b/>
         </w:rPr>
-        <w:t>Nokia Solutions and Networks India — Student Intern</w:t>
+        <w:t>Student Intern</w:t>
+      </w:r>
+      <w:r>
+        <w:tab/>
+        <w:t>Sep 2026 – Present</w:t>
+      </w:r>
+    </w:p>
+    <w:p>
+      <w:pPr>
+        <w:tabs>
+          <w:tab w:pos="10469" w:val="right"/>
+        </w:tabs>
+        <w:spacing w:before="0" w:after="20" w:line="240" w:lineRule="auto"/>
+      </w:pPr>
+      <w:r>
+        <w:rPr>
+          <w:i/>
+        </w:rPr>
+        <w:t>Nokia Solutions and Networks India</w:t>
+      </w:r>
+      <w:r>
+        <w:rPr>
+          <w:i/>
+        </w:rPr>
+        <w:tab/>
+        <w:t>Bangalore</w:t>
+      </w:r>
+    </w:p>
+    <w:p>
+      <w:pPr>
+        <w:pStyle w:val="ListBullet"/>
+        <w:spacing w:before="0" w:after="30" w:line="240" w:lineRule="auto"/>
+      </w:pPr>
+      <w:r>
+        <w:t>Working as a Student Intern at Nokia.</w:t>
+      </w:r>
+    </w:p>
+    <w:p>
+      <w:pPr>
+        <w:tabs>
+          <w:tab w:pos="10469" w:val="right"/>
+        </w:tabs>
+        <w:spacing w:before="60" w:after="0" w:line="240" w:lineRule="auto"/>
+      </w:pPr>
+      <w:r>
+        <w:rPr>
+          <w:b/>
+        </w:rPr>
+        <w:t>AI Research Intern – Deep Learning &amp; Model Development</w:t>
+      </w:r>
+      <w:r>
+        <w:tab/>
+        <w:t>Mar 2026 – Aug 2026</w:t>
+      </w:r>
+    </w:p>
+    <w:p>
+      <w:pPr>
+        <w:tabs>
+          <w:tab w:pos="10469" w:val="right"/>
+        </w:tabs>
+        <w:spacing w:before="0" w:after="20" w:line="240" w:lineRule="auto"/>
+      </w:pPr>
+      <w:r>
+        <w:rPr>
+          <w:i/>
+        </w:rPr>
+        <w:t>iHelp Robotics Private Limited  ·  Project: MITRA</w:t>
+      </w:r>
+      <w:r>
+        <w:rPr>
+          <w:i/>
+        </w:rPr>
+        <w:tab/>
+        <w:t>Remote</w:t>
+      </w:r>
+    </w:p>
+    <w:p>
+      <w:pPr>
+        <w:pStyle w:val="ListBullet"/>
+        <w:spacing w:before="0" w:after="30" w:line="240" w:lineRule="auto"/>
+      </w:pPr>
+      <w:r>
+        <w:t>Improved live camera-stream reliability in the MITRA assistive Android app across 2 video sources (hardware WiFi/RTSP and phone-camera fallback): cut stream search delay, persisted the last working transport, and added refresh/stall recovery.</w:t>
+      </w:r>
+    </w:p>
+    <w:p>
+      <w:pPr>
+        <w:pStyle w:val="ListBullet"/>
+        <w:spacing w:before="0" w:after="30" w:line="240" w:lineRule="auto"/>
+      </w:pPr>
+      <w:r>
+        <w:t>Engineered a visual-freeze watchdog plus 3 status/guard mechanisms — a stream-status panel, a cloud-status panel, and a WebSocket-gated send guard — and fixed a live-refresh loop that recurred after 5 minutes.</w:t>
+      </w:r>
+    </w:p>
+    <w:p>
+      <w:pPr>
+        <w:pStyle w:val="ListBullet"/>
+        <w:spacing w:before="0" w:after="30" w:line="240" w:lineRule="auto"/>
+      </w:pPr>
+      <w:r>
+        <w:t>Hardened offline voice commands (offline-preferred recognition with model recovery and microphone retry backoff) and verified builds across multiple devices with Gradle test/lint/assemble; delivered 6+ app-side improvements while model and backend stayed with a separate team.</w:t>
+      </w:r>
+    </w:p>
+    <w:p>
+      <w:pPr>
+        <w:tabs>
+          <w:tab w:pos="10469" w:val="right"/>
+        </w:tabs>
+        <w:spacing w:before="60" w:after="0" w:line="240" w:lineRule="auto"/>
+      </w:pPr>
+      <w:r>
+        <w:rPr>
+          <w:b/>
+        </w:rPr>
+        <w:t>Student Intern – Skin Disease Classification</w:t>
+      </w:r>
+      <w:r>
+        <w:tab/>
+        <w:t>Jun 2026</w:t>
+      </w:r>
+    </w:p>
+    <w:p>
+      <w:pPr>
+        <w:tabs>
+          <w:tab w:pos="10469" w:val="right"/>
+        </w:tabs>
+        <w:spacing w:before="0" w:after="20" w:line="240" w:lineRule="auto"/>
+      </w:pPr>
+      <w:r>
+        <w:rPr>
+          <w:i/>
+        </w:rPr>
+        <w:t>IEEE EMBS Pune Section</w:t>
+      </w:r>
+      <w:r>
+        <w:rPr>
+          <w:i/>
+        </w:rPr>
+        <w:tab/>
+        <w:t>Remote</w:t>
+      </w:r>
+    </w:p>
+    <w:p>
+      <w:pPr>
+        <w:pStyle w:val="ListBullet"/>
+        <w:spacing w:before="0" w:after="30" w:line="240" w:lineRule="auto"/>
+      </w:pPr>
+      <w:r>
+        <w:t>Trained and evaluated a skin-disease image classifier in a 3-member team during a 1-month IEEE EMBS internship — model selection, training, evaluation, and Python image-processing and testing; delivered a working demo-level workflow.</w:t>
+      </w:r>
+    </w:p>
+    <w:p>
+      <w:pPr>
+        <w:spacing w:before="120" w:after="20" w:line="240" w:lineRule="auto"/>
+        <w:pBdr>
+          <w:bottom w:val="single" w:sz="6" w:space="1" w:color="1F3A5F"/>
+        </w:pBdr>
+      </w:pPr>
+      <w:r>
+        <w:rPr>
+          <w:b/>
+          <w:color w:val="1F3A5F"/>
+          <w:sz w:val="21"/>
+        </w:rPr>
+        <w:t>PROJECTS</w:t>
+      </w:r>
+    </w:p>
+    <w:p>
+      <w:pPr>
+        <w:tabs>
+          <w:tab w:pos="10469" w:val="right"/>
+        </w:tabs>
+        <w:spacing w:before="60" w:after="0" w:line="240" w:lineRule="auto"/>
+      </w:pPr>
+      <w:r>
+        <w:rPr>
+          <w:b/>
+        </w:rPr>
+        <w:t>VisionPay — Real-Time Indian Currency Detection</w:t>
+      </w:r>
+      <w:r>
+        <w:tab/>
+      </w:r>
+      <w:hyperlink r:id="rId14">
+        <w:r>
+          <w:rPr>
+            <w:color w:val="1F5FA8"/>
+            <w:u w:val="single"/>
+            <w:sz w:val="17"/>
+          </w:rPr>
+          <w:t>GitHub</w:t>
+        </w:r>
+      </w:hyperlink>
+    </w:p>
+    <w:p>
+      <w:pPr>
+        <w:spacing w:before="0" w:after="20" w:line="240" w:lineRule="auto"/>
+      </w:pPr>
+      <w:r>
+        <w:rPr>
+          <w:i/>
+          <w:sz w:val="18"/>
+        </w:rPr>
+        <w:t>Python, OpenCV, TensorFlow Lite, MobileNetV2, Text-to-Speech</w:t>
+      </w:r>
+    </w:p>
+    <w:p>
+      <w:pPr>
+        <w:pStyle w:val="ListBullet"/>
+        <w:spacing w:before="0" w:after="30" w:line="240" w:lineRule="auto"/>
+      </w:pPr>
+      <w:r>
+        <w:t>Developed an offline, real-time tool that recognizes Indian currency from a live webcam and speaks the result aloud for visually impaired users.</w:t>
+      </w:r>
+    </w:p>
+    <w:p>
+      <w:pPr>
+        <w:pStyle w:val="ListBullet"/>
+        <w:spacing w:before="0" w:after="30" w:line="240" w:lineRule="auto"/>
+      </w:pPr>
+      <w:r>
+        <w:t>Collected ~400 images per denomination across 6 classes (Rs.10–Rs.500) and trained a MobileNetV2 classifier converted to TensorFlow Lite, reporting ~93% validation accuracy.</w:t>
+      </w:r>
+    </w:p>
+    <w:p>
+      <w:pPr>
+        <w:pStyle w:val="ListBullet"/>
+        <w:spacing w:before="0" w:after="30" w:line="240" w:lineRule="auto"/>
+      </w:pPr>
+      <w:r>
+        <w:t>Improved reliability with 4 mechanisms: confidence/margin gating, temporal smoothing, a background class, and an auto-count mode.</w:t>
+      </w:r>
+    </w:p>
+    <w:p>
+      <w:pPr>
+        <w:tabs>
+          <w:tab w:pos="10469" w:val="right"/>
+        </w:tabs>
+        <w:spacing w:before="60" w:after="0" w:line="240" w:lineRule="auto"/>
+      </w:pPr>
+      <w:r>
+        <w:rPr>
+          <w:b/>
+        </w:rPr>
+        <w:t>Automotive Body Control Module</w:t>
+      </w:r>
+      <w:r>
+        <w:tab/>
+      </w:r>
+      <w:hyperlink r:id="rId15">
+        <w:r>
+          <w:rPr>
+            <w:color w:val="1F5FA8"/>
+            <w:u w:val="single"/>
+            <w:sz w:val="17"/>
+          </w:rPr>
+          <w:t>GitHub</w:t>
+        </w:r>
+      </w:hyperlink>
+    </w:p>
+    <w:p>
+      <w:pPr>
+        <w:spacing w:before="0" w:after="20" w:line="240" w:lineRule="auto"/>
+      </w:pPr>
+      <w:r>
+        <w:rPr>
+          <w:i/>
+          <w:sz w:val="18"/>
+        </w:rPr>
+        <w:t>ESP32, Embedded C, GPIO, OLED, State Machine</w:t>
+      </w:r>
+    </w:p>
+    <w:p>
+      <w:pPr>
+        <w:pStyle w:val="ListBullet"/>
+        <w:spacing w:before="0" w:after="30" w:line="240" w:lineRule="auto"/>
+      </w:pPr>
+      <w:r>
+        <w:t>Programmed an ESP32 body-control module with a 3-state (OFF/ACC/ON) ignition FSM driving 6+ functions: indicators, synchronized hazard, brake logic, buzzer and an OLED dashboard.</w:t>
+      </w:r>
+    </w:p>
+    <w:p>
+      <w:pPr>
+        <w:pStyle w:val="ListBullet"/>
+        <w:spacing w:before="0" w:after="30" w:line="240" w:lineRule="auto"/>
+      </w:pPr>
+      <w:r>
+        <w:t>Architected a non-blocking millis()-based scheduler with brake debouncing, GPIO abstraction and edge-triggered logging for predictable real-time behavior.</w:t>
+      </w:r>
+    </w:p>
+    <w:p>
+      <w:pPr>
+        <w:tabs>
+          <w:tab w:pos="10469" w:val="right"/>
+        </w:tabs>
+        <w:spacing w:before="60" w:after="0" w:line="240" w:lineRule="auto"/>
+      </w:pPr>
+      <w:r>
+        <w:rPr>
+          <w:b/>
+        </w:rPr>
+        <w:t>Smart Wellness Desk Assistant</w:t>
+      </w:r>
+      <w:r>
+        <w:tab/>
+      </w:r>
+      <w:hyperlink r:id="rId16">
+        <w:r>
+          <w:rPr>
+            <w:color w:val="1F5FA8"/>
+            <w:u w:val="single"/>
+            <w:sz w:val="17"/>
+          </w:rPr>
+          <w:t>GitHub</w:t>
+        </w:r>
+      </w:hyperlink>
+    </w:p>
+    <w:p>
+      <w:pPr>
+        <w:spacing w:before="0" w:after="20" w:line="240" w:lineRule="auto"/>
+      </w:pPr>
+      <w:r>
+        <w:rPr>
+          <w:i/>
+          <w:sz w:val="18"/>
+        </w:rPr>
+        <w:t>STM32 Nucleo-L476RG, STM32 HAL, Embedded C, Sensors  ·  College team project</w:t>
+      </w:r>
+    </w:p>
+    <w:p>
+      <w:pPr>
+        <w:pStyle w:val="ListBullet"/>
+        <w:spacing w:before="0" w:after="30" w:line="240" w:lineRule="auto"/>
+      </w:pPr>
+      <w:r>
+        <w:t>Interfaced 2 sensor types (ultrasonic presence and ADC temperature), an I2C OLED, timers and buzzer alerts on an STM32 Nucleo-L476RG as part of a college team; handled wiring, testing and debugging in STM32CubeIDE.</w:t>
+      </w:r>
+    </w:p>
+    <w:p>
+      <w:pPr>
+        <w:tabs>
+          <w:tab w:pos="10469" w:val="right"/>
+        </w:tabs>
+        <w:spacing w:before="60" w:after="0" w:line="240" w:lineRule="auto"/>
+      </w:pPr>
+      <w:r>
+        <w:rPr>
+          <w:b/>
+        </w:rPr>
+        <w:t>AEGIS — AI-Assisted Emergency Response Platform</w:t>
       </w:r>
     </w:p>
     <w:p>
@@ -258,7 +647,7 @@
           <w:i/>
           <w:sz w:val="18"/>
         </w:rPr>
-        <w:t>Bangalore | Sep 2026 – Present</w:t>
+        <w:t>Team lead  ·  Architecture / design stage (in progress)</w:t>
       </w:r>
     </w:p>
     <w:p>
@@ -267,18 +656,62 @@
         <w:spacing w:before="0" w:after="30" w:line="240" w:lineRule="auto"/>
       </w:pPr>
       <w:r>
-        <w:t>Student intern contributing to engineering work; project scope is covered by company confidentiality.</w:t>
+        <w:t>Leading a 3-member team on an original concept, designing a 15-stage response architecture — from incident reporting and GPS/camera/audio inputs through AI analysis, human-dispatcher verification, resource dispatch and live tracking.</w:t>
       </w:r>
     </w:p>
     <w:p>
       <w:pPr>
+        <w:spacing w:before="120" w:after="20" w:line="240" w:lineRule="auto"/>
+        <w:pBdr>
+          <w:bottom w:val="single" w:sz="6" w:space="1" w:color="1F3A5F"/>
+        </w:pBdr>
+      </w:pPr>
+      <w:r>
+        <w:rPr>
+          <w:b/>
+          <w:color w:val="1F3A5F"/>
+          <w:sz w:val="21"/>
+        </w:rPr>
+        <w:t>EDUCATION</w:t>
+      </w:r>
+    </w:p>
+    <w:p>
+      <w:pPr>
+        <w:tabs>
+          <w:tab w:pos="10469" w:val="right"/>
+        </w:tabs>
         <w:spacing w:before="60" w:after="0" w:line="240" w:lineRule="auto"/>
       </w:pPr>
       <w:r>
         <w:rPr>
           <w:b/>
         </w:rPr>
-        <w:t>iHelp Robotics Private Limited — AI Research Intern, Deep Learning &amp; Model Development</w:t>
+        <w:t>B.E. Electronics &amp; Communication Engineering</w:t>
+      </w:r>
+      <w:r>
+        <w:tab/>
+        <w:t>Expected 2027</w:t>
+      </w:r>
+    </w:p>
+    <w:p>
+      <w:pPr>
+        <w:tabs>
+          <w:tab w:pos="10469" w:val="right"/>
+        </w:tabs>
+        <w:spacing w:before="0" w:after="20" w:line="240" w:lineRule="auto"/>
+      </w:pPr>
+      <w:r>
+        <w:rPr>
+          <w:i/>
+        </w:rPr>
+        <w:t>Ballari Institute of Technology and Management (BITM), Ballari</w:t>
+      </w:r>
+      <w:r>
+        <w:rPr>
+          <w:i/>
+        </w:rPr>
+        <w:tab/>
+        <w:t>Final Year  ·  CGPA 8.38</w:t>
       </w:r>
     </w:p>
     <w:p>
@@ -286,199 +719,20 @@
         <w:spacing w:before="0" w:after="20" w:line="240" w:lineRule="auto"/>
       </w:pPr>
       <w:r>
-        <w:rPr>
-          <w:i/>
-          <w:sz w:val="18"/>
-        </w:rPr>
-        <w:t>Remote | Mar 2026 – Aug 2026 | Project: MITRA</w:t>
-      </w:r>
-    </w:p>
-    <w:p>
-      <w:pPr>
-        <w:pStyle w:val="ListBullet"/>
-        <w:spacing w:before="0" w:after="30" w:line="240" w:lineRule="auto"/>
-      </w:pPr>
-      <w:r>
-        <w:t>Improved live camera-stream reliability in the MITRA assistive Android app: reduced WiFi/RTSP stream search delay, persisted the last working transport, and added refresh/stall recovery.</w:t>
-      </w:r>
-    </w:p>
-    <w:p>
-      <w:pPr>
-        <w:pStyle w:val="ListBullet"/>
-        <w:spacing w:before="0" w:after="30" w:line="240" w:lineRule="auto"/>
-      </w:pPr>
-      <w:r>
-        <w:t>Built a visual-freeze watchdog that reconnects when frame counters advance but the image stalls; added on-screen stream- and cloud-status panels and a guard that sends frames only when the cloud WebSocket is connected.</w:t>
-      </w:r>
-    </w:p>
-    <w:p>
-      <w:pPr>
-        <w:pStyle w:val="ListBullet"/>
-        <w:spacing w:before="0" w:after="30" w:line="240" w:lineRule="auto"/>
-      </w:pPr>
-      <w:r>
-        <w:t>Hardened offline voice commands (offline-preferred speech recognition with model recovery and microphone retry backoff); verified builds across devices with Gradle test/lint/assemble runs and captured logs. Backend and model work were handled by another team.</w:t>
-      </w:r>
-    </w:p>
-    <w:p>
-      <w:pPr>
-        <w:spacing w:before="60" w:after="0" w:line="240" w:lineRule="auto"/>
-      </w:pPr>
-      <w:r>
-        <w:rPr>
-          <w:b/>
-        </w:rPr>
-        <w:t>IEEE EMBS Pune Section — Student Intern, Skin Disease Classification</w:t>
-      </w:r>
-    </w:p>
-    <w:p>
-      <w:pPr>
-        <w:spacing w:before="0" w:after="20" w:line="240" w:lineRule="auto"/>
-      </w:pPr>
-      <w:r>
-        <w:rPr>
-          <w:i/>
-          <w:sz w:val="18"/>
-        </w:rPr>
-        <w:t>Remote | Jun 2026</w:t>
-      </w:r>
-    </w:p>
-    <w:p>
-      <w:pPr>
-        <w:pStyle w:val="ListBullet"/>
-        <w:spacing w:before="0" w:after="30" w:line="240" w:lineRule="auto"/>
-      </w:pPr>
-      <w:r>
-        <w:t>Built a demo-level skin-disease image classifier with a 3-person team: model selection, training, evaluation, image processing, UI, and testing in Python.</w:t>
+        <w:t>Class 12: 80%     ·     Class 10: 86.88%</w:t>
       </w:r>
     </w:p>
     <w:p>
       <w:pPr>
         <w:spacing w:before="120" w:after="20" w:line="240" w:lineRule="auto"/>
         <w:pBdr>
-          <w:bottom w:val="single" w:sz="6" w:space="1" w:color="9CA3AF"/>
+          <w:bottom w:val="single" w:sz="6" w:space="1" w:color="1F3A5F"/>
         </w:pBdr>
       </w:pPr>
       <w:r>
         <w:rPr>
           <w:b/>
-          <w:sz w:val="21"/>
-        </w:rPr>
-        <w:t>PROJECTS</w:t>
-      </w:r>
-    </w:p>
-    <w:p>
-      <w:pPr>
-        <w:spacing w:before="60" w:after="0" w:line="240" w:lineRule="auto"/>
-      </w:pPr>
-      <w:r>
-        <w:rPr>
-          <w:b/>
-        </w:rPr>
-        <w:t>VisionPay — Individual</w:t>
-      </w:r>
-    </w:p>
-    <w:p>
-      <w:pPr>
-        <w:spacing w:before="0" w:after="20" w:line="240" w:lineRule="auto"/>
-      </w:pPr>
-      <w:r>
-        <w:rPr>
-          <w:i/>
-          <w:sz w:val="18"/>
-        </w:rPr>
-        <w:t>Python, MobileNetV2, TensorFlow Lite, OpenCV | github.com/MdShabazS/visionpay</w:t>
-      </w:r>
-    </w:p>
-    <w:p>
-      <w:pPr>
-        <w:pStyle w:val="ListBullet"/>
-        <w:spacing w:before="0" w:after="30" w:line="240" w:lineRule="auto"/>
-      </w:pPr>
-      <w:r>
-        <w:t>Built an offline Indian-currency recognizer with spoken feedback for low-vision users: trained a MobileNetV2 model, converted it to TensorFlow Lite, and ran real-time webcam inference with text-to-speech.</w:t>
-      </w:r>
-    </w:p>
-    <w:p>
-      <w:pPr>
-        <w:pStyle w:val="ListBullet"/>
-        <w:spacing w:before="0" w:after="30" w:line="240" w:lineRule="auto"/>
-      </w:pPr>
-      <w:r>
-        <w:t>Collected ~400 images per denomination across 6 note classes; added confidence/margin gating, temporal smoothing, a background class, and auto-count mode; reported ~93% validation accuracy.</w:t>
-      </w:r>
-    </w:p>
-    <w:p>
-      <w:pPr>
-        <w:spacing w:before="60" w:after="0" w:line="240" w:lineRule="auto"/>
-      </w:pPr>
-      <w:r>
-        <w:rPr>
-          <w:b/>
-        </w:rPr>
-        <w:t>Automotive Body Control Module — Individual</w:t>
-      </w:r>
-    </w:p>
-    <w:p>
-      <w:pPr>
-        <w:spacing w:before="0" w:after="20" w:line="240" w:lineRule="auto"/>
-      </w:pPr>
-      <w:r>
-        <w:rPr>
-          <w:i/>
-          <w:sz w:val="18"/>
-        </w:rPr>
-        <w:t>ESP32, Embedded C | github.com/MdShabazS/Automotive-Body-Control-Module-ESP32</w:t>
-      </w:r>
-    </w:p>
-    <w:p>
-      <w:pPr>
-        <w:pStyle w:val="ListBullet"/>
-        <w:spacing w:before="0" w:after="30" w:line="240" w:lineRule="auto"/>
-      </w:pPr>
-      <w:r>
-        <w:t>Built an ESP32 body-control-module prototype with an OFF/ACC/ON ignition state machine, indicators, synchronized hazard mode, and an OLED dashboard.</w:t>
-      </w:r>
-    </w:p>
-    <w:p>
-      <w:pPr>
-        <w:pStyle w:val="ListBullet"/>
-        <w:spacing w:before="0" w:after="30" w:line="240" w:lineRule="auto"/>
-      </w:pPr>
-      <w:r>
-        <w:t>Structured the firmware around non-blocking millis()-based scheduling with brake debouncing, GPIO abstraction, and edge-triggered serial logging.</w:t>
-      </w:r>
-    </w:p>
-    <w:p>
-      <w:pPr>
-        <w:spacing w:before="60" w:after="0" w:line="240" w:lineRule="auto"/>
-      </w:pPr>
-      <w:r>
-        <w:rPr>
-          <w:b/>
-        </w:rPr>
-        <w:t>AEGIS — Team (lead), design stage / in progress</w:t>
-      </w:r>
-    </w:p>
-    <w:p>
-      <w:pPr>
-        <w:pStyle w:val="ListBullet"/>
-        <w:spacing w:before="0" w:after="30" w:line="240" w:lineRule="auto"/>
-      </w:pPr>
-      <w:r>
-        <w:t>Leading a 3-person team designing AEGIS, an AI-assisted emergency-response platform: defined a 15-stage incident workflow where AI analyzes and recommends and a human dispatcher verifies before resources are dispatched.</w:t>
-      </w:r>
-    </w:p>
-    <w:p>
-      <w:pPr>
-        <w:spacing w:before="120" w:after="20" w:line="240" w:lineRule="auto"/>
-        <w:pBdr>
-          <w:bottom w:val="single" w:sz="6" w:space="1" w:color="9CA3AF"/>
-        </w:pBdr>
-      </w:pPr>
-      <w:r>
-        <w:rPr>
-          <w:b/>
+          <w:color w:val="1F3A5F"/>
           <w:sz w:val="21"/>
         </w:rPr>
         <w:t>LEADERSHIP &amp; ACTIVITIES</w:t>
@@ -490,7 +744,7 @@
         <w:spacing w:before="0" w:after="30" w:line="240" w:lineRule="auto"/>
       </w:pPr>
       <w:r>
-        <w:t>Vice-Chair, IEEE CAS Society, IEEE Student Branch BITM (previously Treasurer)</w:t>
+        <w:t>Vice-Chair, IEEE CAS Society, IEEE Student Branch BITM (promoted from Treasurer); Treasurer, BITM Robotics Club.</w:t>
       </w:r>
     </w:p>
     <w:p>
@@ -499,37 +753,20 @@
         <w:spacing w:before="0" w:after="30" w:line="240" w:lineRule="auto"/>
       </w:pPr>
       <w:r>
-        <w:t>Treasurer, BITM Robotics Club</w:t>
-      </w:r>
-    </w:p>
-    <w:p>
-      <w:pPr>
-        <w:pStyle w:val="ListBullet"/>
-        <w:spacing w:before="0" w:after="30" w:line="240" w:lineRule="auto"/>
-      </w:pPr>
-      <w:r>
-        <w:t>Google Student Ambassador, 2025</w:t>
-      </w:r>
-    </w:p>
-    <w:p>
-      <w:pPr>
-        <w:pStyle w:val="ListBullet"/>
-        <w:spacing w:before="0" w:after="30" w:line="240" w:lineRule="auto"/>
-      </w:pPr>
-      <w:r>
-        <w:t>Selected Participant, IEEE SPACE 2026 — B.Tech Initiative</w:t>
+        <w:t>Google Student Ambassador (2025); Selected Participant, IEEE SPACE 2026 — B.Tech Initiative.</w:t>
       </w:r>
     </w:p>
     <w:p>
       <w:pPr>
         <w:spacing w:before="120" w:after="20" w:line="240" w:lineRule="auto"/>
         <w:pBdr>
-          <w:bottom w:val="single" w:sz="6" w:space="1" w:color="9CA3AF"/>
+          <w:bottom w:val="single" w:sz="6" w:space="1" w:color="1F3A5F"/>
         </w:pBdr>
       </w:pPr>
       <w:r>
         <w:rPr>
           <w:b/>
+          <w:color w:val="1F3A5F"/>
           <w:sz w:val="21"/>
         </w:rPr>
         <w:t>CERTIFICATIONS</w:t>
@@ -540,19 +777,20 @@
         <w:spacing w:before="0" w:after="40" w:line="240" w:lineRule="auto"/>
       </w:pPr>
       <w:r>
-        <w:t>Embedded Systems — Internshala Trainings (2025) | Python Programming — EISystems (2024) | Google Cloud Generative AI — SmartBridge/SmartInternz (2025) | SQL for Data Analytics with AI | Programming in C and C++ with AI</w:t>
+        <w:t>Embedded Systems — Internshala Trainings (2025)  ·  Python Programming — EISystems (2024)  ·  Google Cloud Generative AI — SmartBridge/SmartInternz (2025)  ·  SQL for Data Analytics with AI  ·  Programming in C and C++ with AI</w:t>
       </w:r>
     </w:p>
     <w:p>
       <w:pPr>
         <w:spacing w:before="120" w:after="20" w:line="240" w:lineRule="auto"/>
         <w:pBdr>
-          <w:bottom w:val="single" w:sz="6" w:space="1" w:color="9CA3AF"/>
+          <w:bottom w:val="single" w:sz="6" w:space="1" w:color="1F3A5F"/>
         </w:pBdr>
       </w:pPr>
       <w:r>
         <w:rPr>
           <w:b/>
+          <w:color w:val="1F3A5F"/>
           <w:sz w:val="21"/>
         </w:rPr>
         <w:t>LANGUAGES</w:t>
@@ -563,12 +801,12 @@
         <w:spacing w:before="0" w:after="0" w:line="240" w:lineRule="auto"/>
       </w:pPr>
       <w:r>
-        <w:t>English, Kannada, Hindi, Urdu</w:t>
+        <w:t>English  ·  Kannada  ·  Hindi  ·  Urdu</w:t>
       </w:r>
     </w:p>
     <w:sectPr>
-      <w:pgSz w:w="12240" w:h="15840"/>
-      <w:pgMar w:top="720" w:right="792" w:bottom="720" w:left="792" w:header="720" w:footer="720" w:gutter="0"/>
+      <w:pgSz w:w="11909" w:h="16834"/>
+      <w:pgMar w:top="576" w:right="720" w:bottom="576" w:left="720" w:header="720" w:footer="720" w:gutter="0"/>
       <w:cols w:space="720"/>
       <w:docGrid w:linePitch="360"/>
     </w:sectPr>

</xml_diff>

<commit_message>
feat: build embedded automotive tier-1 resume
Repivot the master resume to Embedded Engineer | Automotive Embedded
Systems (primary) with software as secondary. Rebuild the resume research
around embedded/automotive Tier-1 JDs, reorder projects embedded-first
(Automotive BCM, Smart Wellness, VisionPay), drop AEGIS (planned/off-domain)
and the spoken-languages section, and lock the skills set (remove Java and
Firebase; keep protocols/RTOS/automotive standards out of skills, in bullets
only). Update build/validate scripts and ATS analysis accordingly.

Co-Authored-By: Claude Opus 4.8 <noreply@anthropic.com>
</commit_message>
<xml_diff>
--- a/resume/Mohammed_Shabaz_S_Master_Resume.docx
+++ b/resume/Mohammed_Shabaz_S_Master_Resume.docx
@@ -26,7 +26,7 @@
           <w:color w:val="1F3A5F"/>
           <w:sz w:val="21"/>
         </w:rPr>
-        <w:t>Software Developer  |  Embedded Engineer</w:t>
+        <w:t>Embedded Engineer  |  Automotive Embedded Systems</w:t>
       </w:r>
     </w:p>
     <w:p>
@@ -184,7 +184,7 @@
         <w:spacing w:before="0" w:after="40" w:line="240" w:lineRule="auto"/>
       </w:pPr>
       <w:r>
-        <w:t>Final-year Electronics &amp; Communication Engineering student (CGPA 8.38) building across software and embedded systems. Internships at Nokia and iHelp Robotics, with projects in Android, computer vision, and microcontroller firmware using C, C++, Python and Embedded C. Currently deepening data structures, algorithms and SQL for software and embedded roles.</w:t>
+        <w:t>Final-year Electronics &amp; Communication Engineering student (CGPA 8.38) focused on embedded and automotive firmware — microcontroller systems, finite-state machines and non-blocking real-time design in Embedded C — with a working software and computer-vision foundation in C, C++ and Python. Internship experience at Nokia and iHelp Robotics.</w:t>
       </w:r>
     </w:p>
     <w:p>
@@ -211,34 +211,6 @@
         <w:rPr>
           <w:b/>
         </w:rPr>
-        <w:t xml:space="preserve">Languages: </w:t>
-      </w:r>
-      <w:r>
-        <w:t>C, C++, Python, Java, SQL</w:t>
-      </w:r>
-    </w:p>
-    <w:p>
-      <w:pPr>
-        <w:spacing w:before="0" w:after="20" w:line="240" w:lineRule="auto"/>
-      </w:pPr>
-      <w:r>
-        <w:rPr>
-          <w:b/>
-        </w:rPr>
-        <w:t xml:space="preserve">Software &amp; Tools: </w:t>
-      </w:r>
-      <w:r>
-        <w:t>Android Studio, OpenCV, Firebase, Git, GitHub</w:t>
-      </w:r>
-    </w:p>
-    <w:p>
-      <w:pPr>
-        <w:spacing w:before="0" w:after="20" w:line="240" w:lineRule="auto"/>
-      </w:pPr>
-      <w:r>
-        <w:rPr>
-          <w:b/>
-        </w:rPr>
         <w:t xml:space="preserve">Embedded: </w:t>
       </w:r>
       <w:r>
@@ -253,10 +225,38 @@
         <w:rPr>
           <w:b/>
         </w:rPr>
+        <w:t xml:space="preserve">Languages: </w:t>
+      </w:r>
+      <w:r>
+        <w:t>C, C++, Python, SQL</w:t>
+      </w:r>
+    </w:p>
+    <w:p>
+      <w:pPr>
+        <w:spacing w:before="0" w:after="20" w:line="240" w:lineRule="auto"/>
+      </w:pPr>
+      <w:r>
+        <w:rPr>
+          <w:b/>
+        </w:rPr>
+        <w:t xml:space="preserve">Tools &amp; Platforms: </w:t>
+      </w:r>
+      <w:r>
+        <w:t>Android Studio, Git &amp; GitHub, OpenCV</w:t>
+      </w:r>
+    </w:p>
+    <w:p>
+      <w:pPr>
+        <w:spacing w:before="0" w:after="20" w:line="240" w:lineRule="auto"/>
+      </w:pPr>
+      <w:r>
+        <w:rPr>
+          <w:b/>
+        </w:rPr>
         <w:t xml:space="preserve">CS Fundamentals: </w:t>
       </w:r>
       <w:r>
-        <w:t>Data Structures &amp; Algorithms, DBMS, Operating Systems, Computer Networks</w:t>
+        <w:t>Data Structures &amp; Algorithms, Operating Systems, DBMS, Computer Networks</w:t>
       </w:r>
     </w:p>
     <w:p>
@@ -290,7 +290,7 @@
       </w:r>
       <w:r>
         <w:tab/>
-        <w:t>Sep 2026 – Present</w:t>
+        <w:t>16 September 2026 – Present</w:t>
       </w:r>
     </w:p>
     <w:p>
@@ -338,7 +338,7 @@
       </w:r>
       <w:r>
         <w:tab/>
-        <w:t>Mar 2026 – Aug 2026</w:t>
+        <w:t>23 March 2026 – 23 August 2026</w:t>
       </w:r>
     </w:p>
     <w:p>
@@ -377,7 +377,7 @@
         <w:spacing w:before="0" w:after="30" w:line="240" w:lineRule="auto"/>
       </w:pPr>
       <w:r>
-        <w:t>Engineered a visual-freeze watchdog plus 3 status/guard mechanisms — a stream-status panel, a cloud-status panel, and a WebSocket-gated send guard — and fixed a live-refresh loop that recurred after 5 minutes.</w:t>
+        <w:t>Engineered a visual-freeze watchdog plus 3 status/guard mechanisms — stream-status and cloud-status panels and a WebSocket-gated send guard — and fixed a live-refresh loop that recurred after 5 minutes.</w:t>
       </w:r>
     </w:p>
     <w:p>
@@ -404,7 +404,7 @@
       </w:r>
       <w:r>
         <w:tab/>
-        <w:t>Jun 2026</w:t>
+        <w:t>1–30 June 2026</w:t>
       </w:r>
     </w:p>
     <w:p>
@@ -464,7 +464,7 @@
         <w:rPr>
           <w:b/>
         </w:rPr>
-        <w:t>VisionPay — Real-Time Indian Currency Detection</w:t>
+        <w:t>Automotive Body Control Module</w:t>
       </w:r>
       <w:r>
         <w:tab/>
@@ -489,7 +489,7 @@
           <w:i/>
           <w:sz w:val="18"/>
         </w:rPr>
-        <w:t>Python, OpenCV, TensorFlow Lite, MobileNetV2, Text-to-Speech</w:t>
+        <w:t>ESP32, Embedded C, Finite-State Machine, GPIO, OLED</w:t>
       </w:r>
     </w:p>
     <w:p>
@@ -498,7 +498,7 @@
         <w:spacing w:before="0" w:after="30" w:line="240" w:lineRule="auto"/>
       </w:pPr>
       <w:r>
-        <w:t>Developed an offline, real-time tool that recognizes Indian currency from a live webcam and speaks the result aloud for visually impaired users.</w:t>
+        <w:t>Programmed an ESP32 body-control module with a 3-state (OFF/ACC/ON) ignition FSM driving 6+ vehicle functions: indicators, synchronized hazard, brake logic, buzzer feedback and an OLED dashboard.</w:t>
       </w:r>
     </w:p>
     <w:p>
@@ -507,73 +507,7 @@
         <w:spacing w:before="0" w:after="30" w:line="240" w:lineRule="auto"/>
       </w:pPr>
       <w:r>
-        <w:t>Collected ~400 images per denomination across 6 classes (Rs.10–Rs.500) and trained a MobileNetV2 classifier converted to TensorFlow Lite, reporting ~93% validation accuracy.</w:t>
-      </w:r>
-    </w:p>
-    <w:p>
-      <w:pPr>
-        <w:pStyle w:val="ListBullet"/>
-        <w:spacing w:before="0" w:after="30" w:line="240" w:lineRule="auto"/>
-      </w:pPr>
-      <w:r>
-        <w:t>Improved reliability with 4 mechanisms: confidence/margin gating, temporal smoothing, a background class, and an auto-count mode.</w:t>
-      </w:r>
-    </w:p>
-    <w:p>
-      <w:pPr>
-        <w:tabs>
-          <w:tab w:pos="10469" w:val="right"/>
-        </w:tabs>
-        <w:spacing w:before="60" w:after="0" w:line="240" w:lineRule="auto"/>
-      </w:pPr>
-      <w:r>
-        <w:rPr>
-          <w:b/>
-        </w:rPr>
-        <w:t>Automotive Body Control Module</w:t>
-      </w:r>
-      <w:r>
-        <w:tab/>
-      </w:r>
-      <w:hyperlink r:id="rId15">
-        <w:r>
-          <w:rPr>
-            <w:color w:val="1F5FA8"/>
-            <w:u w:val="single"/>
-            <w:sz w:val="17"/>
-          </w:rPr>
-          <w:t>GitHub</w:t>
-        </w:r>
-      </w:hyperlink>
-    </w:p>
-    <w:p>
-      <w:pPr>
-        <w:spacing w:before="0" w:after="20" w:line="240" w:lineRule="auto"/>
-      </w:pPr>
-      <w:r>
-        <w:rPr>
-          <w:i/>
-          <w:sz w:val="18"/>
-        </w:rPr>
-        <w:t>ESP32, Embedded C, GPIO, OLED, State Machine</w:t>
-      </w:r>
-    </w:p>
-    <w:p>
-      <w:pPr>
-        <w:pStyle w:val="ListBullet"/>
-        <w:spacing w:before="0" w:after="30" w:line="240" w:lineRule="auto"/>
-      </w:pPr>
-      <w:r>
-        <w:t>Programmed an ESP32 body-control module with a 3-state (OFF/ACC/ON) ignition FSM driving 6+ functions: indicators, synchronized hazard, brake logic, buzzer and an OLED dashboard.</w:t>
-      </w:r>
-    </w:p>
-    <w:p>
-      <w:pPr>
-        <w:pStyle w:val="ListBullet"/>
-        <w:spacing w:before="0" w:after="30" w:line="240" w:lineRule="auto"/>
-      </w:pPr>
-      <w:r>
-        <w:t>Architected a non-blocking millis()-based scheduler with brake debouncing, GPIO abstraction and edge-triggered logging for predictable real-time behavior.</w:t>
+        <w:t>Architected a non-blocking millis()-based scheduler with brake debouncing, GPIO abstraction and edge-triggered serial logging for predictable real-time behavior.</w:t>
       </w:r>
     </w:p>
     <w:p>
@@ -592,7 +526,7 @@
       <w:r>
         <w:tab/>
       </w:r>
-      <w:hyperlink r:id="rId16">
+      <w:hyperlink r:id="rId15">
         <w:r>
           <w:rPr>
             <w:color w:val="1F5FA8"/>
@@ -635,8 +569,21 @@
         <w:rPr>
           <w:b/>
         </w:rPr>
-        <w:t>AEGIS — AI-Assisted Emergency Response Platform</w:t>
+        <w:t>VisionPay — Real-Time Indian Currency Detection</w:t>
       </w:r>
+      <w:r>
+        <w:tab/>
+      </w:r>
+      <w:hyperlink r:id="rId16">
+        <w:r>
+          <w:rPr>
+            <w:color w:val="1F5FA8"/>
+            <w:u w:val="single"/>
+            <w:sz w:val="17"/>
+          </w:rPr>
+          <w:t>GitHub</w:t>
+        </w:r>
+      </w:hyperlink>
     </w:p>
     <w:p>
       <w:pPr>
@@ -647,7 +594,7 @@
           <w:i/>
           <w:sz w:val="18"/>
         </w:rPr>
-        <w:t>Team lead  ·  Architecture / design stage (in progress)</w:t>
+        <w:t>Python, OpenCV, TensorFlow Lite, MobileNetV2, Text-to-Speech</w:t>
       </w:r>
     </w:p>
     <w:p>
@@ -656,7 +603,25 @@
         <w:spacing w:before="0" w:after="30" w:line="240" w:lineRule="auto"/>
       </w:pPr>
       <w:r>
-        <w:t>Leading a 3-member team on an original concept, designing a 15-stage response architecture — from incident reporting and GPS/camera/audio inputs through AI analysis, human-dispatcher verification, resource dispatch and live tracking.</w:t>
+        <w:t>Created an offline, real-time tool that recognizes Indian currency from a live webcam and speaks the result aloud for visually impaired users.</w:t>
+      </w:r>
+    </w:p>
+    <w:p>
+      <w:pPr>
+        <w:pStyle w:val="ListBullet"/>
+        <w:spacing w:before="0" w:after="30" w:line="240" w:lineRule="auto"/>
+      </w:pPr>
+      <w:r>
+        <w:t>Collected ~400 images per denomination across 6 classes (Rs.10–Rs.500) and trained a MobileNetV2 classifier converted to TensorFlow Lite, reporting ~93% validation accuracy.</w:t>
+      </w:r>
+    </w:p>
+    <w:p>
+      <w:pPr>
+        <w:pStyle w:val="ListBullet"/>
+        <w:spacing w:before="0" w:after="30" w:line="240" w:lineRule="auto"/>
+      </w:pPr>
+      <w:r>
+        <w:t>Strengthened real-time reliability with 4 mechanisms: confidence/margin gating, temporal smoothing, a background class, and an auto-count mode.</w:t>
       </w:r>
     </w:p>
     <w:p>
@@ -758,6 +723,15 @@
     </w:p>
     <w:p>
       <w:pPr>
+        <w:pStyle w:val="ListBullet"/>
+        <w:spacing w:before="0" w:after="30" w:line="240" w:lineRule="auto"/>
+      </w:pPr>
+      <w:r>
+        <w:t>Embedded AI Systems workshop with STMicroelectronics (DigiToad, 2025); Participant, Techzone Nationals 2K25 Hardware Hackathon.</w:t>
+      </w:r>
+    </w:p>
+    <w:p>
+      <w:pPr>
         <w:spacing w:before="120" w:after="20" w:line="240" w:lineRule="auto"/>
         <w:pBdr>
           <w:bottom w:val="single" w:sz="6" w:space="1" w:color="1F3A5F"/>
@@ -774,34 +748,10 @@
     </w:p>
     <w:p>
       <w:pPr>
-        <w:spacing w:before="0" w:after="40" w:line="240" w:lineRule="auto"/>
-      </w:pPr>
-      <w:r>
-        <w:t>Embedded Systems — Internshala Trainings (2025)  ·  Python Programming — EISystems (2024)  ·  Google Cloud Generative AI — SmartBridge/SmartInternz (2025)  ·  SQL for Data Analytics with AI  ·  Programming in C and C++ with AI</w:t>
-      </w:r>
-    </w:p>
-    <w:p>
-      <w:pPr>
-        <w:spacing w:before="120" w:after="20" w:line="240" w:lineRule="auto"/>
-        <w:pBdr>
-          <w:bottom w:val="single" w:sz="6" w:space="1" w:color="1F3A5F"/>
-        </w:pBdr>
-      </w:pPr>
-      <w:r>
-        <w:rPr>
-          <w:b/>
-          <w:color w:val="1F3A5F"/>
-          <w:sz w:val="21"/>
-        </w:rPr>
-        <w:t>LANGUAGES</w:t>
-      </w:r>
-    </w:p>
-    <w:p>
-      <w:pPr>
         <w:spacing w:before="0" w:after="0" w:line="240" w:lineRule="auto"/>
       </w:pPr>
       <w:r>
-        <w:t>English  ·  Kannada  ·  Hindi  ·  Urdu</w:t>
+        <w:t>Embedded Systems — Internshala Trainings (2025)  ·  Programming in C and C++ with AI  ·  SQL for Data Analytics with AI  ·  Google Cloud Generative AI — SmartBridge/SmartInternz (2025)  ·  Python Programming — EISystems (2024)</w:t>
       </w:r>
     </w:p>
     <w:sectPr>

</xml_diff>

<commit_message>
feat: optimize embedded automotive resume ats alignment
Second-pass optimization toward stronger external ATS alignment without
fabrication. Verified project-repo evidence and enriched the Technical Skills
section into a JD-mirroring taxonomy where every token is also proven in a
bullet: add the verified ARM Cortex-M4 (STM32L476RG), STM32CubeIDE, Arduino,
GPIO/I2C/ADC/timers/sensor interfacing, and ESP32/STM32 platforms. Tighten the
summary with ARM Cortex-M/ESP32/STM32, quantify the BCM and Smart Wellness
bullets (30 ms debounce, 10 Hz refresh, 12-bit ADC), raising the quantified
ratio to ~71%. Add an external-style JD-alignment report (full JD keyword sets
incl. gaps) and whitespace-normalized matching to the validator; update the ATS
analysis with honest per-role alignment. No fabricated skills: UART/SPI/RTOS/
CAN/AUTOSAR/MISRA/ISO 26262 remain learning gaps.

Co-Authored-By: Claude Opus 4.8 <noreply@anthropic.com>
</commit_message>
<xml_diff>
--- a/resume/Mohammed_Shabaz_S_Master_Resume.docx
+++ b/resume/Mohammed_Shabaz_S_Master_Resume.docx
@@ -184,7 +184,7 @@
         <w:spacing w:before="0" w:after="40" w:line="240" w:lineRule="auto"/>
       </w:pPr>
       <w:r>
-        <w:t>Final-year Electronics &amp; Communication Engineering student (CGPA 8.38) focused on embedded and automotive firmware — microcontroller systems, finite-state machines and non-blocking real-time design in Embedded C — with a working software and computer-vision foundation in C, C++ and Python. Internship experience at Nokia and iHelp Robotics.</w:t>
+        <w:t>Final-year Electronics &amp; Communication Engineering student (CGPA 8.38) focused on embedded and automotive firmware — ARM Cortex-M microcontroller systems, finite-state machines and non-blocking real-time design in Embedded C/C++ on ESP32 and STM32 — with a working software and computer-vision foundation in Python. Internship experience at Nokia and iHelp Robotics.</w:t>
       </w:r>
     </w:p>
     <w:p>
@@ -211,10 +211,10 @@
         <w:rPr>
           <w:b/>
         </w:rPr>
-        <w:t xml:space="preserve">Embedded: </w:t>
+        <w:t xml:space="preserve">Languages: </w:t>
       </w:r>
       <w:r>
-        <w:t>Embedded C, Microcontrollers</w:t>
+        <w:t>C, C++, Embedded C, Python, SQL</w:t>
       </w:r>
     </w:p>
     <w:p>
@@ -225,10 +225,10 @@
         <w:rPr>
           <w:b/>
         </w:rPr>
-        <w:t xml:space="preserve">Languages: </w:t>
+        <w:t xml:space="preserve">Embedded &amp; Firmware: </w:t>
       </w:r>
       <w:r>
-        <w:t>C, C++, Python, SQL</w:t>
+        <w:t>Microcontrollers, ARM Cortex-M4, finite-state machines, non-blocking real-time design, GPIO, I2C, ADC, timers, sensor interfacing, debugging</w:t>
       </w:r>
     </w:p>
     <w:p>
@@ -239,10 +239,10 @@
         <w:rPr>
           <w:b/>
         </w:rPr>
-        <w:t xml:space="preserve">Tools &amp; Platforms: </w:t>
+        <w:t xml:space="preserve">Platforms &amp; Tools: </w:t>
       </w:r>
       <w:r>
-        <w:t>Android Studio, Git &amp; GitHub, OpenCV</w:t>
+        <w:t>ESP32, STM32 (Nucleo-L476RG), STM32CubeIDE, Arduino, Android Studio, Git &amp; GitHub</w:t>
       </w:r>
     </w:p>
     <w:p>
@@ -253,10 +253,10 @@
         <w:rPr>
           <w:b/>
         </w:rPr>
-        <w:t xml:space="preserve">CS Fundamentals: </w:t>
+        <w:t xml:space="preserve">Libraries &amp; Foundations: </w:t>
       </w:r>
       <w:r>
-        <w:t>Data Structures &amp; Algorithms, Operating Systems, DBMS, Computer Networks</w:t>
+        <w:t>OpenCV, TensorFlow Lite  ·  Data Structures &amp; Algorithms, Operating Systems, DBMS, Computer Networks</w:t>
       </w:r>
     </w:p>
     <w:p>
@@ -489,7 +489,7 @@
           <w:i/>
           <w:sz w:val="18"/>
         </w:rPr>
-        <w:t>ESP32, Embedded C, Finite-State Machine, GPIO, OLED</w:t>
+        <w:t>ESP32, Arduino/C++, Finite-State Machine, GPIO, I2C OLED</w:t>
       </w:r>
     </w:p>
     <w:p>
@@ -498,7 +498,7 @@
         <w:spacing w:before="0" w:after="30" w:line="240" w:lineRule="auto"/>
       </w:pPr>
       <w:r>
-        <w:t>Programmed an ESP32 body-control module with a 3-state (OFF/ACC/ON) ignition FSM driving 6+ vehicle functions: indicators, synchronized hazard, brake logic, buzzer feedback and an OLED dashboard.</w:t>
+        <w:t>Programmed an ESP32 body-control module with a 3-state (OFF/ACC/ON) ignition FSM driving 6+ vehicle functions: turn indicators, synchronized hazard, brake logic, buzzer feedback and an OLED dashboard.</w:t>
       </w:r>
     </w:p>
     <w:p>
@@ -507,7 +507,7 @@
         <w:spacing w:before="0" w:after="30" w:line="240" w:lineRule="auto"/>
       </w:pPr>
       <w:r>
-        <w:t>Architected a non-blocking millis()-based scheduler with brake debouncing, GPIO abstraction and edge-triggered serial logging for predictable real-time behavior.</w:t>
+        <w:t>Architected a non-blocking millis()-based scheduler (zero delay() in the main loop) with 30 ms brake debouncing, throttled 10 Hz I2C OLED refresh, a clean GPIO abstraction and edge-triggered serial logging for deterministic real-time behavior.</w:t>
       </w:r>
     </w:p>
     <w:p>
@@ -546,7 +546,7 @@
           <w:i/>
           <w:sz w:val="18"/>
         </w:rPr>
-        <w:t>STM32 Nucleo-L476RG, STM32 HAL, Embedded C, Sensors  ·  College team project</w:t>
+        <w:t>STM32 Nucleo-L476RG (ARM Cortex-M4), STM32 HAL, STM32CubeIDE, Embedded C  ·  College team project</w:t>
       </w:r>
     </w:p>
     <w:p>
@@ -555,7 +555,7 @@
         <w:spacing w:before="0" w:after="30" w:line="240" w:lineRule="auto"/>
       </w:pPr>
       <w:r>
-        <w:t>Interfaced 2 sensor types (ultrasonic presence and ADC temperature), an I2C OLED, timers and buzzer alerts on an STM32 Nucleo-L476RG as part of a college team; handled wiring, testing and debugging in STM32CubeIDE.</w:t>
+        <w:t>Interfaced ultrasonic presence and 12-bit ADC temperature sensors, an I2C SSD1306 OLED and timer-driven buzzer alerts on an STM32 Nucleo-L476RG (ARM Cortex-M4) using STM32 HAL, coordinated by a non-blocking finite-state machine; wired, tested and debugged in STM32CubeIDE as part of a college team.</w:t>
       </w:r>
     </w:p>
     <w:p>

</xml_diff>